<commit_message>
docs: portada, sección 9, enlace del repositorio y Anexo A actualizado
Co-Authored-By: Claude Opus 5.5 <noreply@anthropic.com>
</commit_message>
<xml_diff>
--- a/docs/guia06/Informe_Guia06_Estandares_EcoRecicla_UMB.docx
+++ b/docs/guia06/Informe_Guia06_Estandares_EcoRecicla_UMB.docx
@@ -154,14 +154,6 @@
           <w:szCs w:val="24"/>
         </w:rPr>
       </w:pPr>
-      <w:r>
-        <w:rPr>
-          <w:rFonts w:ascii="Times New Roman" w:hAnsi="Times New Roman" w:cs="Times New Roman"/>
-          <w:sz w:val="24"/>
-          <w:szCs w:val="24"/>
-        </w:rPr>
-        <w:t>Códigos: __________ y __________</w:t>
-      </w:r>
     </w:p>
     <w:p>
       <w:pPr>
@@ -173,6 +165,14 @@
           <w:szCs w:val="24"/>
         </w:rPr>
       </w:pPr>
+      <w:r>
+        <w:rPr>
+          <w:rFonts w:ascii="Times New Roman" w:hAnsi="Times New Roman" w:cs="Times New Roman"/>
+          <w:sz w:val="24"/>
+          <w:szCs w:val="24"/>
+        </w:rPr>
+        <w:t>Universidad Manuela Beltrán</w:t>
+      </w:r>
     </w:p>
     <w:p>
       <w:pPr>
@@ -190,7 +190,7 @@
           <w:sz w:val="24"/>
           <w:szCs w:val="24"/>
         </w:rPr>
-        <w:t>Universidad Manuela Beltrán</w:t>
+        <w:t>Estándares y Métricas de Calidad de Software</w:t>
       </w:r>
     </w:p>
     <w:p>
@@ -209,7 +209,7 @@
           <w:sz w:val="24"/>
           <w:szCs w:val="24"/>
         </w:rPr>
-        <w:t>Estándares y Métricas de Calidad de Software</w:t>
+        <w:t>Docente: Mauricio Morales Meneses</w:t>
       </w:r>
     </w:p>
     <w:p>
@@ -228,26 +228,7 @@
           <w:sz w:val="24"/>
           <w:szCs w:val="24"/>
         </w:rPr>
-        <w:t>Docente: ______________________________</w:t>
-      </w:r>
-    </w:p>
-    <w:p>
-      <w:pPr>
-        <w:spacing w:line="480" w:lineRule="auto"/>
-        <w:jc w:val="center"/>
-        <w:rPr>
-          <w:rFonts w:ascii="Times New Roman" w:hAnsi="Times New Roman" w:cs="Times New Roman"/>
-          <w:sz w:val="24"/>
-          <w:szCs w:val="24"/>
-        </w:rPr>
-      </w:pPr>
-      <w:r>
-        <w:rPr>
-          <w:rFonts w:ascii="Times New Roman" w:hAnsi="Times New Roman" w:cs="Times New Roman"/>
-          <w:sz w:val="24"/>
-          <w:szCs w:val="24"/>
-        </w:rPr>
-        <w:t>15/10/2026</w:t>
+        <w:t>18/10/2026</w:t>
       </w:r>
     </w:p>
     <w:p>
@@ -7343,7 +7324,7 @@
         <w:ind w:firstLine="720"/>
       </w:pPr>
       <w:r>
-        <w:t>Se grabó un video en inglés, apoyado en una presentación de 11 diapositivas, que expone el marco teórico de la familia ISO 9000 y de la serie ISO/IEC 25000, las respuestas del cuestionario de trabajo autónomo, la clasificación de los tipos de pruebas, el plan de pruebas de EcoRecicla y el código de las pruebas automatizadas con su ejecución. Su duración, de aproximadamente tres minutos, cumple a la vez con el mínimo de la Sesión 3 (3 a 5 minutos) y con el máximo de la actividad de comprobación (1 a 3 minuto</w:t>
+        <w:t>Se grabó un video en inglés, apoyado en una presentación de 11 diapositivas, que expone el marco teórico de la familia ISO 9000 y de la serie ISO/IEC 25000, las respuestas del cuestionario de trabajo autónomo, la clasificación de los tipos de pruebas, el plan de pruebas de EcoRecicla y el código de las pruebas automatizadas con su ejecución. Su duración, de tres minutos, cumple a la vez con el mínimo de la Sesión 3 (3 a 5 minutos) y con el máximo de la actividad de comprobación (1 a 3 minuto</w:t>
       </w:r>
       <w:r>
         <w:t>s). El video se publicó en YouTube y en el foro de la actividad.</w:t>
@@ -20458,7 +20439,7 @@
         <w:t>Calidad del proceso frente a calidad del producto.</w:t>
       </w:r>
       <w:r>
-        <w:t xml:space="preserve"> Aprendimos que ISO 9001 y CMMI certifican cómo trabaja una organización, mientras que ISO/IEC 25010 y su familia definen cómo debe ser el producto. En nuestro futuro profesional, al trabajar en una empresa certificada, entenderemos que el certificado no reemplaza las pruebas: nuestros planes, casos y reportes de defectos serán la evidencia que revisan los auditores.</w:t>
+        <w:t xml:space="preserve"> ISO 9001 y CMMI certifican cómo trabaja una organización; ISO/IEC 25010 y su familia definen cómo debe ser el producto. El certificado no reemplaza las pruebas: los planes, los casos y los reportes de defectos son la evidencia que revisa un auditor.</w:t>
       </w:r>
     </w:p>
     <w:p>
@@ -20474,10 +20455,10 @@
           <w:b/>
           <w:bCs/>
         </w:rPr>
-        <w:t>Los requisitos no funcionales deben ser medibles.</w:t>
-      </w:r>
-      <w:r>
-        <w:t xml:space="preserve"> El recorrido del RNF-03 por la serie ISO/IEC 25000 nos mostró cómo transformar una frase vaga en una medida con umbral. Esto será útil al escribir criterios de aceptación, al negociar con clientes y al evitar discusiones subjetivas sobre si el sistema «es rápido» o «es seguro».</w:t>
+        <w:t>Un plan de pruebas se deriva del sistema real.</w:t>
+      </w:r>
+      <w:r>
+        <w:t xml:space="preserve"> Al contrastar el primer borrador con el código de EcoRecicla encontramos rutas, módulos y códigos HTTP que no existían. Aprendimos que cada escenario debe salir de un requisito (RF1 a RF10, RNF1 a RNF6) y validarse contra la implementación, no contra una idea general de la aplicación.</w:t>
       </w:r>
     </w:p>
     <w:p>
@@ -20493,10 +20474,10 @@
           <w:b/>
           <w:bCs/>
         </w:rPr>
-        <w:t>Probar es una actividad que se planifica.</w:t>
-      </w:r>
-      <w:r>
-        <w:t xml:space="preserve"> Antes de esta guía, probar era ejecutar la aplicación y ver si funcionaba. Ahora entendemos que un plan de pruebas define alcance, estrategia, criterios de salida y gestión de defectos. El rol de analista de pruebas o QA es una puerta de entrada frecuente a la industria, y este conocimiento es la base de certificaciones como ISTQB Foundation Level.</w:t>
+        <w:t>El código también se diseña para ser probado.</w:t>
+      </w:r>
+      <w:r>
+        <w:t xml:space="preserve"> Para usar Supertest tuvimos que separar la app de Express del arranque del servidor y llevar el cálculo del CO₂ a una función pura. Así entendimos en la práctica la capacidad de ser probado, una subcaracterística de la mantenibilidad en ISO/IEC 25010.</w:t>
       </w:r>
     </w:p>
     <w:p>
@@ -20512,10 +20493,10 @@
           <w:b/>
           <w:bCs/>
         </w:rPr>
-        <w:t>Una estructura común facilita aprender otras normas.</w:t>
-      </w:r>
-      <w:r>
-        <w:t xml:space="preserve"> Como ISO 9001, ISO/IEC 27001 e ISO/IEC 42001 comparten la estructura armonizada, entender una facilita implementar las demás en sistemas de gestión integrados.</w:t>
+        <w:t>Los requisitos no funcionales deben ser medibles.</w:t>
+      </w:r>
+      <w:r>
+        <w:t xml:space="preserve"> El recorrido del RNF-03 por la serie ISO/IEC 25000 nos mostró cómo convertir «la aplicación debe ser rápida» en un percentil 95 ≤ 2 s que una prueba puede confirmar o refutar.</w:t>
       </w:r>
     </w:p>
     <w:p>
@@ -20524,6 +20505,38 @@
       </w:pPr>
       <w:r>
         <w:t>9.2 ¿Dónde se Presentó Mayor Dificultad y Cómo se Resolvió?</w:t>
+      </w:r>
+    </w:p>
+    <w:p>
+      <w:pPr>
+        <w:pStyle w:val="CuerpoAPA"/>
+        <w:ind w:firstLine="720"/>
+      </w:pPr>
+      <w:r>
+        <w:rPr>
+          <w:b/>
+          <w:bCs/>
+        </w:rPr>
+        <w:t>Alinear el plan de pruebas con la API real.</w:t>
+      </w:r>
+      <w:r>
+        <w:t xml:space="preserve"> Varios escenarios mencionaban funciones que el proyecto no tiene (edición del perfil, paginación, bloqueo de intentos) y una ruta inexistente. Estrategia de solución: revisar uno a uno los requisitos, las historias de usuario y las rutas del código, y reescribir los escenarios con los códigos HTTP reales, manteniendo los 19 escenarios y cubriendo los diez requisitos funcionales.</w:t>
+      </w:r>
+    </w:p>
+    <w:p>
+      <w:pPr>
+        <w:pStyle w:val="CuerpoAPA"/>
+        <w:ind w:firstLine="720"/>
+      </w:pPr>
+      <w:r>
+        <w:rPr>
+          <w:b/>
+          <w:bCs/>
+        </w:rPr>
+        <w:t>Probar la API sin depender de la base de datos.</w:t>
+      </w:r>
+      <w:r>
+        <w:t xml:space="preserve"> La app de Express abría el puerto al importarse, lo que impedía usar Supertest. Estrategia de solución: separar app.js, que exporta la app, de server.js, que ejecuta app.listen(), y elegir una prueba de integración que se resuelve en el middleware de autenticación, antes de consultar MySQL.</w:t>
       </w:r>
     </w:p>
     <w:p>
@@ -20540,54 +20553,6 @@
       </w:r>
       <w:r>
         <w:t xml:space="preserve"> Muchas fuentes en línea las presentan como si siguieran vigentes. Estrategia de solución: contrastar con fuentes oficiales y con la cronología de revisiones de ISO 9001, y distinguir ISO 9003 de ISO 9000-3 (la antigua guía para software).</w:t>
-      </w:r>
-    </w:p>
-    <w:p>
-      <w:pPr>
-        <w:pStyle w:val="CuerpoAPA"/>
-        <w:ind w:firstLine="720"/>
-      </w:pPr>
-      <w:r>
-        <w:rPr>
-          <w:b/>
-          <w:bCs/>
-        </w:rPr>
-        <w:t>Acceso limitado al texto completo de las normas</w:t>
-      </w:r>
-      <w:r>
-        <w:t>, porque las normas ISO son documentos de pago. Estrategia de solución: usar la vista previa gratuita de la plataforma de consulta en línea de ISO (OBP), las bases de datos de la biblioteca de la UMB (e-Libro) y fuentes secundarias académicas, citándolas en formato APA.</w:t>
-      </w:r>
-    </w:p>
-    <w:p>
-      <w:pPr>
-        <w:pStyle w:val="CuerpoAPA"/>
-        <w:ind w:firstLine="720"/>
-      </w:pPr>
-      <w:r>
-        <w:rPr>
-          <w:b/>
-          <w:bCs/>
-        </w:rPr>
-        <w:t>Vigencia de las certificaciones de las empresas colombianas</w:t>
-      </w:r>
-      <w:r>
-        <w:t>, porque los resultados de CMMI vencen a los tres años y muchas noticias son antiguas. Estrategia de solución: indicar el año de cada evidencia y recomendar su verificación en los registros públicos (PARS e IAF CertSearch).</w:t>
-      </w:r>
-    </w:p>
-    <w:p>
-      <w:pPr>
-        <w:pStyle w:val="CuerpoAPA"/>
-        <w:ind w:firstLine="720"/>
-      </w:pPr>
-      <w:r>
-        <w:rPr>
-          <w:b/>
-          <w:bCs/>
-        </w:rPr>
-        <w:t>Aplicar normas generales a un proyecto pequeño.</w:t>
-      </w:r>
-      <w:r>
-        <w:t xml:space="preserve"> Estrategia de solución: trabajar con un requisito concreto de punta a punta (RNF-03) y priorizar las pruebas por riesgo, en lugar de intentar aplicar todas las características del modelo a la vez.</w:t>
       </w:r>
     </w:p>
     <w:p>
@@ -20928,13 +20893,17 @@
               <w:pStyle w:val="CuerpoAPA"/>
               <w:spacing w:line="240" w:lineRule="auto"/>
             </w:pPr>
-            <w:r>
-              <w:rPr>
-                <w:sz w:val="20"/>
-                <w:szCs w:val="20"/>
-              </w:rPr>
-              <w:t>[pegar enlace]</w:t>
-            </w:r>
+            <w:hyperlink r:id="rId25" w:history="1">
+              <w:r>
+                <w:rPr>
+                  <w:color w:val="0563C1"/>
+                  <w:sz w:val="20"/>
+                  <w:szCs w:val="20"/>
+                  <w:u w:val="single"/>
+                </w:rPr>
+                <w:t>https://github.com/daviid0611/ecorecicla</w:t>
+              </w:r>
+            </w:hyperlink>
           </w:p>
         </w:tc>
       </w:tr>
@@ -21657,6 +21626,19 @@
       </w:pPr>
       <w:r>
         <w:t>Salida del comando git log --oneline -n 20 en el repositorio del proyecto:</w:t>
+      </w:r>
+    </w:p>
+    <w:p>
+      <w:pPr>
+        <w:pStyle w:val="CuerpoAPA"/>
+        <w:spacing w:line="240" w:lineRule="auto"/>
+      </w:pPr>
+      <w:r>
+        <w:rPr>
+          <w:rFonts w:ascii="Consolas" w:eastAsia="Consolas" w:hAnsi="Consolas" w:cs="Consolas"/>
+          <w:sz w:val="18"/>
+        </w:rPr>
+        <w:t>c91b9df docs: informe Guía 6 con plan de pruebas alineado a la API</w:t>
       </w:r>
     </w:p>
     <w:p>

</xml_diff>